<commit_message>
Versión 0.8.1: textos en tercera persona, sin referencias internas
Co-Authored-By: Claude Opus 5.5 <noreply@anthropic.com>
</commit_message>
<xml_diff>
--- a/12_Cases/Vivienda Espana/SOIH_12_Vivienda_Articulo_v0.1.docx
+++ b/12_Cases/Vivienda Espana/SOIH_12_Vivienda_Articulo_v0.1.docx
@@ -49,7 +49,7 @@
     <w:p>
       <w:pPr>
         <w:shd w:val="clear" w:color="auto" w:fill="EAF2F8"/>
-        <w:divId w:val="816146198"/>
+        <w:divId w:val="943923943"/>
         <w:rPr>
           <w:rFonts w:ascii="Calibri" w:eastAsia="Times New Roman" w:hAnsi="Calibri" w:cs="Calibri"/>
           <w:color w:val="1F2933"/>
@@ -5003,9 +5003,9 @@
 <file path=word/numbering.xml><?xml version="1.0" encoding="utf-8"?>
 <w:numbering xmlns:wpc="http://schemas.microsoft.com/office/word/2010/wordprocessingCanvas" xmlns:cx="http://schemas.microsoft.com/office/drawing/2014/chartex" xmlns:cx1="http://schemas.microsoft.com/office/drawing/2015/9/8/chartex" xmlns:cx2="http://schemas.microsoft.com/office/drawing/2015/10/21/chartex" xmlns:cx3="http://schemas.microsoft.com/office/drawing/2016/5/9/chartex" xmlns:cx4="http://schemas.microsoft.com/office/drawing/2016/5/10/chartex" xmlns:cx5="http://schemas.microsoft.com/office/drawing/2016/5/11/chartex" xmlns:cx6="http://schemas.microsoft.com/office/drawing/2016/5/12/chartex" xmlns:cx7="http://schemas.microsoft.com/office/drawing/2016/5/13/chartex" xmlns:cx8="http://schemas.microsoft.com/office/drawing/2016/5/14/chartex" xmlns:mc="http://schemas.openxmlformats.org/markup-compatibility/2006" xmlns:aink="http://schemas.microsoft.com/office/drawing/2016/ink" xmlns:am3d="http://schemas.microsoft.com/office/drawing/2017/model3d" xmlns:o="urn:schemas-microsoft-com:office:office" xmlns:oel="http://schemas.microsoft.com/office/2019/extlst" xmlns:r="http://schemas.openxmlformats.org/officeDocument/2006/relationships" xmlns:m="http://schemas.openxmlformats.org/officeDocument/2006/math" xmlns:v="urn:schemas-microsoft-com:vml" xmlns:wp14="http://schemas.microsoft.com/office/word/2010/wordprocessingDrawing" xmlns:wp="http://schemas.openxmlformats.org/drawingml/2006/wordprocessingDrawing" xmlns:w10="urn:schemas-microsoft-com:office:word" xmlns:w="http://schemas.openxmlformats.org/wordprocessingml/2006/main" xmlns:w14="http://schemas.microsoft.com/office/word/2010/wordml" xmlns:w15="http://schemas.microsoft.com/office/word/2012/wordml" xmlns:w16cex="http://schemas.microsoft.com/office/word/2018/wordml/cex" xmlns:w16cid="http://schemas.microsoft.com/office/word/2016/wordml/cid" xmlns:w16="http://schemas.microsoft.com/office/word/2018/wordml" xmlns:w16sdtdh="http://schemas.microsoft.com/office/word/2020/wordml/sdtdatahash" xmlns:w16se="http://schemas.microsoft.com/office/word/2015/wordml/symex" xmlns:wpg="http://schemas.microsoft.com/office/word/2010/wordprocessingGroup" xmlns:wpi="http://schemas.microsoft.com/office/word/2010/wordprocessingInk" xmlns:wne="http://schemas.microsoft.com/office/word/2006/wordml" xmlns:wps="http://schemas.microsoft.com/office/word/2010/wordprocessingShape" mc:Ignorable="w14 w15 w16se w16cid w16 w16cex w16sdtdh wp14">
   <w:abstractNum w:abstractNumId="0" w15:restartNumberingAfterBreak="0">
-    <w:nsid w:val="26AC58BB"/>
+    <w:nsid w:val="0FE21339"/>
     <w:multiLevelType w:val="multilevel"/>
-    <w:tmpl w:val="882EE898"/>
+    <w:tmpl w:val="677A45C6"/>
     <w:lvl w:ilvl="0">
       <w:start w:val="1"/>
       <w:numFmt w:val="bullet"/>
@@ -5152,9 +5152,9 @@
     </w:lvl>
   </w:abstractNum>
   <w:abstractNum w:abstractNumId="1" w15:restartNumberingAfterBreak="0">
-    <w:nsid w:val="42D243BB"/>
+    <w:nsid w:val="240D3373"/>
     <w:multiLevelType w:val="multilevel"/>
-    <w:tmpl w:val="24309C7A"/>
+    <w:tmpl w:val="E2628504"/>
     <w:lvl w:ilvl="0">
       <w:start w:val="1"/>
       <w:numFmt w:val="bullet"/>
@@ -5301,9 +5301,9 @@
     </w:lvl>
   </w:abstractNum>
   <w:abstractNum w:abstractNumId="2" w15:restartNumberingAfterBreak="0">
-    <w:nsid w:val="4C6F04A5"/>
+    <w:nsid w:val="4339259D"/>
     <w:multiLevelType w:val="multilevel"/>
-    <w:tmpl w:val="BDBC6D7A"/>
+    <w:tmpl w:val="55E006D0"/>
     <w:lvl w:ilvl="0">
       <w:start w:val="1"/>
       <w:numFmt w:val="bullet"/>
@@ -5449,14 +5449,14 @@
       </w:rPr>
     </w:lvl>
   </w:abstractNum>
-  <w:num w:numId="1" w16cid:durableId="812796239">
+  <w:num w:numId="1" w16cid:durableId="665403794">
+    <w:abstractNumId w:val="0"/>
+  </w:num>
+  <w:num w:numId="2" w16cid:durableId="1567641138">
     <w:abstractNumId w:val="2"/>
   </w:num>
-  <w:num w:numId="2" w16cid:durableId="802581171">
+  <w:num w:numId="3" w16cid:durableId="984241334">
     <w:abstractNumId w:val="1"/>
-  </w:num>
-  <w:num w:numId="3" w16cid:durableId="1604609407">
-    <w:abstractNumId w:val="0"/>
   </w:num>
 </w:numbering>
 </file>

</xml_diff>